<commit_message>
docs(hsk2): thêm dàn bài chuẩn HSKK 初级 vào phần 回答问题 buổi 1-4
Co-Authored-By: Claude Sonnet 5 <noreply@anthropic.com>
</commit_message>
<xml_diff>
--- a/output/hsk2/buoi01_moian_vitquay/baitap/dapan/dapan.docx
+++ b/output/hsk2/buoi01_moian_vitquay/baitap/dapan/dapan.docx
@@ -41,7 +41,7 @@
     </w:p>
     <w:p>
       <w:pPr>
-        <w:spacing w:before="280"/>
+        <w:spacing w:before="200"/>
       </w:pPr>
       <w:r>
         <w:rPr>
@@ -258,7 +258,7 @@
     </w:p>
     <w:p>
       <w:pPr>
-        <w:spacing w:before="280"/>
+        <w:spacing w:before="200"/>
       </w:pPr>
       <w:r>
         <w:rPr>
@@ -411,7 +411,7 @@
     </w:p>
     <w:p>
       <w:pPr>
-        <w:spacing w:before="280"/>
+        <w:spacing w:before="200"/>
       </w:pPr>
       <w:r>
         <w:rPr>
@@ -763,7 +763,7 @@
     </w:p>
     <w:p>
       <w:pPr>
-        <w:spacing w:before="280"/>
+        <w:spacing w:before="200"/>
       </w:pPr>
       <w:r>
         <w:rPr>
@@ -989,7 +989,7 @@
     </w:p>
     <w:p>
       <w:pPr>
-        <w:spacing w:before="280"/>
+        <w:spacing w:before="200"/>
       </w:pPr>
       <w:r>
         <w:rPr>
@@ -1215,7 +1215,7 @@
     </w:p>
     <w:p>
       <w:pPr>
-        <w:spacing w:before="280"/>
+        <w:spacing w:before="200"/>
       </w:pPr>
       <w:r>
         <w:rPr>
@@ -1372,7 +1372,7 @@
     </w:p>
     <w:p>
       <w:pPr>
-        <w:spacing w:before="280"/>
+        <w:spacing w:before="200"/>
       </w:pPr>
       <w:r>
         <w:rPr>
@@ -1463,7 +1463,7 @@
     </w:p>
     <w:p>
       <w:pPr>
-        <w:spacing w:before="280"/>
+        <w:spacing w:before="200"/>
       </w:pPr>
       <w:r>
         <w:rPr>
@@ -1632,7 +1632,7 @@
     </w:p>
     <w:p>
       <w:pPr>
-        <w:spacing w:before="280"/>
+        <w:spacing w:before="200"/>
       </w:pPr>
       <w:r>
         <w:rPr>
@@ -1786,7 +1786,7 @@
     </w:p>
     <w:sectPr>
       <w:pgSz w:w="12240" w:h="15840"/>
-      <w:pgMar w:top="1440" w:right="1800" w:bottom="1440" w:left="1800" w:header="720" w:footer="720" w:gutter="0"/>
+      <w:pgMar w:top="864" w:right="1008" w:bottom="864" w:left="1008" w:header="720" w:footer="720" w:gutter="0"/>
       <w:cols w:space="720"/>
       <w:docGrid w:linePitch="360"/>
     </w:sectPr>
@@ -2157,6 +2157,9 @@
     <w:name w:val="Normal"/>
     <w:qFormat/>
     <w:rsid w:val="00FC693F"/>
+    <w:pPr>
+      <w:spacing w:before="0" w:after="40" w:line="240" w:lineRule="auto"/>
+    </w:pPr>
   </w:style>
   <w:style w:type="paragraph" w:styleId="Header">
     <w:name w:val="header"/>

</xml_diff>